<commit_message>
tesztelési doksi ad rész
</commit_message>
<xml_diff>
--- a/Dokumentacio/veglegesek/QUBE_tesztelesi_dokumentacio.docx
+++ b/Dokumentacio/veglegesek/QUBE_tesztelesi_dokumentacio.docx
@@ -6569,7 +6569,7 @@
               </wp:anchor>
             </w:drawing>
           </mc:Choice>
-          <mc:Fallback xmlns:w16sdtfl="http://schemas.microsoft.com/office/word/2024/wordml/sdtformatlock" xmlns:w16du="http://schemas.microsoft.com/office/word/2023/wordml/word16du" xmlns:oel="http://schemas.microsoft.com/office/2019/extlst">
+          <mc:Fallback xmlns:oel="http://schemas.microsoft.com/office/2019/extlst" xmlns:w16du="http://schemas.microsoft.com/office/word/2023/wordml/word16du" xmlns:w16sdtfl="http://schemas.microsoft.com/office/word/2024/wordml/sdtformatlock">
             <w:pict>
               <v:group w14:anchorId="09064078" id="Csoportba foglalás 18" o:spid="_x0000_s1026" style="position:absolute;margin-left:1.1pt;margin-top:49.2pt;width:452.75pt;height:296.4pt;z-index:251713536;mso-position-horizontal-relative:margin;mso-width-relative:margin;mso-height-relative:margin" coordorigin="104" coordsize="57502,37645" o:gfxdata="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">
                 <v:shapetype id="_x0000_t75" coordsize="21600,21600" o:spt="75" o:preferrelative="t" path="m@4@5l@4@11@9@11@9@5xe" filled="f" stroked="f">
@@ -7087,7 +7087,7 @@
         <mc:AlternateContent>
           <mc:Choice Requires="wps">
             <w:drawing>
-              <wp:anchor distT="0" distB="0" distL="114300" distR="114300" simplePos="0" relativeHeight="251723776" behindDoc="0" locked="0" layoutInCell="1" allowOverlap="1" wp14:anchorId="494459A8" wp14:editId="47070127">
+              <wp:anchor distT="0" distB="0" distL="114300" distR="114300" simplePos="0" relativeHeight="251723776" behindDoc="0" locked="0" layoutInCell="1" allowOverlap="1" wp14:anchorId="494459A8" wp14:editId="6E54D858">
                 <wp:simplePos x="0" y="0"/>
                 <wp:positionH relativeFrom="margin">
                   <wp:align>right</wp:align>
@@ -7372,10 +7372,1498 @@
     </w:p>
     <w:p>
       <w:pPr>
+        <w:spacing w:before="100" w:beforeAutospacing="1" w:after="100" w:afterAutospacing="1" w:line="240" w:lineRule="auto"/>
+        <w:jc w:val="left"/>
+        <w:rPr>
+          <w:rFonts w:eastAsia="Times New Roman" w:cs="Times New Roman"/>
+          <w:szCs w:val="24"/>
+          <w:lang w:val="hu-HU" w:eastAsia="hu-HU"/>
+        </w:rPr>
+      </w:pPr>
+      <w:r>
+        <w:rPr>
+          <w:noProof/>
+        </w:rPr>
+        <mc:AlternateContent>
+          <mc:Choice Requires="wps">
+            <w:drawing>
+              <wp:anchor distT="0" distB="0" distL="114300" distR="114300" simplePos="0" relativeHeight="251725824" behindDoc="1" locked="0" layoutInCell="1" allowOverlap="1" wp14:anchorId="30B9CD46" wp14:editId="5543AA03">
+                <wp:simplePos x="0" y="0"/>
+                <wp:positionH relativeFrom="margin">
+                  <wp:align>left</wp:align>
+                </wp:positionH>
+                <wp:positionV relativeFrom="paragraph">
+                  <wp:posOffset>4682186</wp:posOffset>
+                </wp:positionV>
+                <wp:extent cx="5743575" cy="635"/>
+                <wp:effectExtent l="0" t="0" r="9525" b="11430"/>
+                <wp:wrapTopAndBottom/>
+                <wp:docPr id="3" name="Szövegdoboz 1"/>
+                <wp:cNvGraphicFramePr/>
+                <a:graphic xmlns:a="http://schemas.openxmlformats.org/drawingml/2006/main">
+                  <a:graphicData uri="http://schemas.microsoft.com/office/word/2010/wordprocessingShape">
+                    <wps:wsp>
+                      <wps:cNvSpPr txBox="1"/>
+                      <wps:spPr>
+                        <a:xfrm>
+                          <a:off x="0" y="0"/>
+                          <a:ext cx="5743575" cy="635"/>
+                        </a:xfrm>
+                        <a:prstGeom prst="rect">
+                          <a:avLst/>
+                        </a:prstGeom>
+                        <a:noFill/>
+                        <a:ln>
+                          <a:noFill/>
+                        </a:ln>
+                      </wps:spPr>
+                      <wps:txbx>
+                        <w:txbxContent>
+                          <w:p>
+                            <w:pPr>
+                              <w:pStyle w:val="Kpalrs"/>
+                              <w:jc w:val="center"/>
+                            </w:pPr>
+                            <w:r>
+                              <w:t>1</w:t>
+                            </w:r>
+                            <w:r>
+                              <w:t>4</w:t>
+                            </w:r>
+                            <w:r>
+                              <w:t>.1</w:t>
+                            </w:r>
+                            <w:r>
+                              <w:t>.</w:t>
+                            </w:r>
+                            <w:r>
+                              <w:t xml:space="preserve"> ábra</w:t>
+                            </w:r>
+                            <w:r>
+                              <w:t>: Bolti telephely eszközei</w:t>
+                            </w:r>
+                          </w:p>
+                        </w:txbxContent>
+                      </wps:txbx>
+                      <wps:bodyPr rot="0" spcFirstLastPara="0" vertOverflow="overflow" horzOverflow="overflow" vert="horz" wrap="square" lIns="0" tIns="0" rIns="0" bIns="0" numCol="1" spcCol="0" rtlCol="0" fromWordArt="0" anchor="t" anchorCtr="0" forceAA="0" compatLnSpc="1">
+                        <a:prstTxWarp prst="textNoShape">
+                          <a:avLst/>
+                        </a:prstTxWarp>
+                        <a:spAutoFit/>
+                      </wps:bodyPr>
+                    </wps:wsp>
+                  </a:graphicData>
+                </a:graphic>
+                <wp14:sizeRelH relativeFrom="margin">
+                  <wp14:pctWidth>0</wp14:pctWidth>
+                </wp14:sizeRelH>
+                <wp14:sizeRelV relativeFrom="margin">
+                  <wp14:pctHeight>0</wp14:pctHeight>
+                </wp14:sizeRelV>
+              </wp:anchor>
+            </w:drawing>
+          </mc:Choice>
+          <mc:Fallback>
+            <w:pict>
+              <v:shape w14:anchorId="30B9CD46" id="_x0000_s1048" type="#_x0000_t202" style="position:absolute;margin-left:0;margin-top:368.7pt;width:452.25pt;height:.05pt;z-index:-251590656;visibility:visible;mso-wrap-style:square;mso-width-percent:0;mso-height-percent:0;mso-wrap-distance-left:9pt;mso-wrap-distance-top:0;mso-wrap-distance-right:9pt;mso-wrap-distance-bottom:0;mso-position-horizontal:left;mso-position-horizontal-relative:margin;mso-position-vertical:absolute;mso-position-vertical-relative:text;mso-width-percent:0;mso-height-percent:0;mso-width-relative:margin;mso-height-relative:margin;v-text-anchor:top" o:gfxdata="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" filled="f" stroked="f">
+                <v:textbox style="mso-fit-shape-to-text:t" inset="0,0,0,0">
+                  <w:txbxContent>
+                    <w:p>
+                      <w:pPr>
+                        <w:pStyle w:val="Kpalrs"/>
+                        <w:jc w:val="center"/>
+                      </w:pPr>
+                      <w:r>
+                        <w:t>1</w:t>
+                      </w:r>
+                      <w:r>
+                        <w:t>4</w:t>
+                      </w:r>
+                      <w:r>
+                        <w:t>.1</w:t>
+                      </w:r>
+                      <w:r>
+                        <w:t>.</w:t>
+                      </w:r>
+                      <w:r>
+                        <w:t xml:space="preserve"> ábra</w:t>
+                      </w:r>
+                      <w:r>
+                        <w:t>: Bolti telephely eszközei</w:t>
+                      </w:r>
+                    </w:p>
+                  </w:txbxContent>
+                </v:textbox>
+                <w10:wrap type="topAndBottom" anchorx="margin"/>
+              </v:shape>
+            </w:pict>
+          </mc:Fallback>
+        </mc:AlternateContent>
+      </w:r>
+      <w:r>
+        <w:rPr>
+          <w:noProof/>
+        </w:rPr>
+        <w:drawing>
+          <wp:anchor distT="0" distB="0" distL="114300" distR="114300" simplePos="0" relativeHeight="251740160" behindDoc="0" locked="0" layoutInCell="1" allowOverlap="1" wp14:anchorId="67C1F2B3" wp14:editId="0E6E0C58">
+            <wp:simplePos x="0" y="0"/>
+            <wp:positionH relativeFrom="margin">
+              <wp:align>left</wp:align>
+            </wp:positionH>
+            <wp:positionV relativeFrom="paragraph">
+              <wp:posOffset>936321</wp:posOffset>
+            </wp:positionV>
+            <wp:extent cx="5759450" cy="3707130"/>
+            <wp:effectExtent l="19050" t="19050" r="12700" b="26670"/>
+            <wp:wrapSquare wrapText="bothSides"/>
+            <wp:docPr id="2" name="Kép 2"/>
+            <wp:cNvGraphicFramePr>
+              <a:graphicFrameLocks xmlns:a="http://schemas.openxmlformats.org/drawingml/2006/main" noChangeAspect="1"/>
+            </wp:cNvGraphicFramePr>
+            <a:graphic xmlns:a="http://schemas.openxmlformats.org/drawingml/2006/main">
+              <a:graphicData uri="http://schemas.openxmlformats.org/drawingml/2006/picture">
+                <pic:pic xmlns:pic="http://schemas.openxmlformats.org/drawingml/2006/picture">
+                  <pic:nvPicPr>
+                    <pic:cNvPr id="0" name="Picture 6"/>
+                    <pic:cNvPicPr>
+                      <a:picLocks noChangeAspect="1" noChangeArrowheads="1"/>
+                    </pic:cNvPicPr>
+                  </pic:nvPicPr>
+                  <pic:blipFill>
+                    <a:blip r:embed="rId39">
+                      <a:extLst>
+                        <a:ext uri="{28A0092B-C50C-407E-A947-70E740481C1C}">
+                          <a14:useLocalDpi xmlns:a14="http://schemas.microsoft.com/office/drawing/2010/main" val="0"/>
+                        </a:ext>
+                      </a:extLst>
+                    </a:blip>
+                    <a:srcRect/>
+                    <a:stretch>
+                      <a:fillRect/>
+                    </a:stretch>
+                  </pic:blipFill>
+                  <pic:spPr bwMode="auto">
+                    <a:xfrm>
+                      <a:off x="0" y="0"/>
+                      <a:ext cx="5759450" cy="3707130"/>
+                    </a:xfrm>
+                    <a:prstGeom prst="rect">
+                      <a:avLst/>
+                    </a:prstGeom>
+                    <a:noFill/>
+                    <a:ln>
+                      <a:solidFill>
+                        <a:schemeClr val="tx1"/>
+                      </a:solidFill>
+                    </a:ln>
+                  </pic:spPr>
+                </pic:pic>
+              </a:graphicData>
+            </a:graphic>
+          </wp:anchor>
+        </w:drawing>
+      </w:r>
+      <w:r>
+        <w:rPr>
+          <w:rFonts w:eastAsia="Times New Roman" w:cs="Times New Roman"/>
+          <w:szCs w:val="24"/>
+          <w:lang w:val="hu-HU" w:eastAsia="hu-HU"/>
+        </w:rPr>
+        <w:t>A központi hitelesítés és a címtárstruktúra (OU, felhasználók) integritásának ellenőrzése.</w:t>
+      </w:r>
+      <w:r>
+        <w:rPr>
+          <w:rFonts w:eastAsia="Times New Roman" w:cs="Times New Roman"/>
+          <w:szCs w:val="24"/>
+          <w:lang w:val="hu-HU" w:eastAsia="hu-HU"/>
+        </w:rPr>
+        <w:t xml:space="preserve"> </w:t>
+      </w:r>
+      <w:r>
+        <w:rPr>
+          <w:rFonts w:eastAsia="Times New Roman" w:cs="Times New Roman"/>
+          <w:szCs w:val="24"/>
+          <w:lang w:val="hu-HU" w:eastAsia="hu-HU"/>
+        </w:rPr>
+        <w:t>Windows Server 2022 (Domain Controller) szolgáltatása, TCP/IP kapcsolaton keresztül kommunikálva a tartományhoz csatolt kliensgépekkel.</w:t>
+      </w:r>
+      <w:r>
+        <w:rPr>
+          <w:rFonts w:eastAsia="Times New Roman" w:cs="Times New Roman"/>
+          <w:szCs w:val="24"/>
+          <w:lang w:val="hu-HU" w:eastAsia="hu-HU"/>
+        </w:rPr>
+        <w:t xml:space="preserve"> </w:t>
+      </w:r>
+      <w:r>
+        <w:rPr>
+          <w:rFonts w:eastAsia="Times New Roman" w:cs="Times New Roman"/>
+          <w:szCs w:val="24"/>
+          <w:lang w:val="hu-HU" w:eastAsia="hu-HU"/>
+        </w:rPr>
+        <w:t>Új felhasználói fiók létrehozása az ADUC konzolon, majd sikeres bejelentkezés végrehajtása egy munkaállomásról.</w:t>
+      </w:r>
+    </w:p>
+    <w:p>
+      <w:pPr>
+        <w:spacing w:before="100" w:beforeAutospacing="1" w:after="100" w:afterAutospacing="1" w:line="240" w:lineRule="auto"/>
+        <w:jc w:val="left"/>
+        <w:rPr>
+          <w:rFonts w:eastAsia="Times New Roman" w:cs="Times New Roman"/>
+          <w:szCs w:val="24"/>
+          <w:lang w:val="hu-HU" w:eastAsia="hu-HU"/>
+        </w:rPr>
+      </w:pPr>
+      <w:r>
+        <w:rPr>
+          <w:noProof/>
+        </w:rPr>
+        <w:lastRenderedPageBreak/>
+        <mc:AlternateContent>
+          <mc:Choice Requires="wps">
+            <w:drawing>
+              <wp:anchor distT="0" distB="0" distL="114300" distR="114300" simplePos="0" relativeHeight="251729920" behindDoc="1" locked="0" layoutInCell="1" allowOverlap="1" wp14:anchorId="17ABD4F5" wp14:editId="2A96730B">
+                <wp:simplePos x="0" y="0"/>
+                <wp:positionH relativeFrom="margin">
+                  <wp:align>right</wp:align>
+                </wp:positionH>
+                <wp:positionV relativeFrom="paragraph">
+                  <wp:posOffset>6768990</wp:posOffset>
+                </wp:positionV>
+                <wp:extent cx="5743575" cy="635"/>
+                <wp:effectExtent l="0" t="0" r="9525" b="11430"/>
+                <wp:wrapTopAndBottom/>
+                <wp:docPr id="8" name="Szövegdoboz 1"/>
+                <wp:cNvGraphicFramePr/>
+                <a:graphic xmlns:a="http://schemas.openxmlformats.org/drawingml/2006/main">
+                  <a:graphicData uri="http://schemas.microsoft.com/office/word/2010/wordprocessingShape">
+                    <wps:wsp>
+                      <wps:cNvSpPr txBox="1"/>
+                      <wps:spPr>
+                        <a:xfrm>
+                          <a:off x="0" y="0"/>
+                          <a:ext cx="5743575" cy="635"/>
+                        </a:xfrm>
+                        <a:prstGeom prst="rect">
+                          <a:avLst/>
+                        </a:prstGeom>
+                        <a:noFill/>
+                        <a:ln>
+                          <a:noFill/>
+                        </a:ln>
+                      </wps:spPr>
+                      <wps:txbx>
+                        <w:txbxContent>
+                          <w:p>
+                            <w:pPr>
+                              <w:pStyle w:val="Kpalrs"/>
+                              <w:jc w:val="center"/>
+                            </w:pPr>
+                            <w:r>
+                              <w:t>1</w:t>
+                            </w:r>
+                            <w:r>
+                              <w:t>4</w:t>
+                            </w:r>
+                            <w:r>
+                              <w:t>.</w:t>
+                            </w:r>
+                            <w:r>
+                              <w:t>3</w:t>
+                            </w:r>
+                            <w:r>
+                              <w:t>.</w:t>
+                            </w:r>
+                            <w:r>
+                              <w:t xml:space="preserve"> ábra</w:t>
+                            </w:r>
+                            <w:r>
+                              <w:t>: Bolti telephely</w:t>
+                            </w:r>
+                            <w:r>
+                              <w:t xml:space="preserve"> csoportja</w:t>
+                            </w:r>
+                            <w:r>
+                              <w:t>i</w:t>
+                            </w:r>
+                          </w:p>
+                        </w:txbxContent>
+                      </wps:txbx>
+                      <wps:bodyPr rot="0" spcFirstLastPara="0" vertOverflow="overflow" horzOverflow="overflow" vert="horz" wrap="square" lIns="0" tIns="0" rIns="0" bIns="0" numCol="1" spcCol="0" rtlCol="0" fromWordArt="0" anchor="t" anchorCtr="0" forceAA="0" compatLnSpc="1">
+                        <a:prstTxWarp prst="textNoShape">
+                          <a:avLst/>
+                        </a:prstTxWarp>
+                        <a:spAutoFit/>
+                      </wps:bodyPr>
+                    </wps:wsp>
+                  </a:graphicData>
+                </a:graphic>
+                <wp14:sizeRelH relativeFrom="margin">
+                  <wp14:pctWidth>0</wp14:pctWidth>
+                </wp14:sizeRelH>
+                <wp14:sizeRelV relativeFrom="margin">
+                  <wp14:pctHeight>0</wp14:pctHeight>
+                </wp14:sizeRelV>
+              </wp:anchor>
+            </w:drawing>
+          </mc:Choice>
+          <mc:Fallback>
+            <w:pict>
+              <v:shape w14:anchorId="17ABD4F5" id="_x0000_s1049" type="#_x0000_t202" style="position:absolute;margin-left:401.05pt;margin-top:533pt;width:452.25pt;height:.05pt;z-index:-251586560;visibility:visible;mso-wrap-style:square;mso-width-percent:0;mso-height-percent:0;mso-wrap-distance-left:9pt;mso-wrap-distance-top:0;mso-wrap-distance-right:9pt;mso-wrap-distance-bottom:0;mso-position-horizontal:right;mso-position-horizontal-relative:margin;mso-position-vertical:absolute;mso-position-vertical-relative:text;mso-width-percent:0;mso-height-percent:0;mso-width-relative:margin;mso-height-relative:margin;v-text-anchor:top" o:gfxdata="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" filled="f" stroked="f">
+                <v:textbox style="mso-fit-shape-to-text:t" inset="0,0,0,0">
+                  <w:txbxContent>
+                    <w:p>
+                      <w:pPr>
+                        <w:pStyle w:val="Kpalrs"/>
+                        <w:jc w:val="center"/>
+                      </w:pPr>
+                      <w:r>
+                        <w:t>1</w:t>
+                      </w:r>
+                      <w:r>
+                        <w:t>4</w:t>
+                      </w:r>
+                      <w:r>
+                        <w:t>.</w:t>
+                      </w:r>
+                      <w:r>
+                        <w:t>3</w:t>
+                      </w:r>
+                      <w:r>
+                        <w:t>.</w:t>
+                      </w:r>
+                      <w:r>
+                        <w:t xml:space="preserve"> ábra</w:t>
+                      </w:r>
+                      <w:r>
+                        <w:t>: Bolti telephely</w:t>
+                      </w:r>
+                      <w:r>
+                        <w:t xml:space="preserve"> csoportja</w:t>
+                      </w:r>
+                      <w:r>
+                        <w:t>i</w:t>
+                      </w:r>
+                    </w:p>
+                  </w:txbxContent>
+                </v:textbox>
+                <w10:wrap type="topAndBottom" anchorx="margin"/>
+              </v:shape>
+            </w:pict>
+          </mc:Fallback>
+        </mc:AlternateContent>
+      </w:r>
+      <w:r>
+        <w:rPr>
+          <w:noProof/>
+        </w:rPr>
+        <w:drawing>
+          <wp:anchor distT="0" distB="0" distL="114300" distR="114300" simplePos="0" relativeHeight="251739136" behindDoc="0" locked="0" layoutInCell="1" allowOverlap="1" wp14:anchorId="63910C64" wp14:editId="1661FD31">
+            <wp:simplePos x="0" y="0"/>
+            <wp:positionH relativeFrom="margin">
+              <wp:align>left</wp:align>
+            </wp:positionH>
+            <wp:positionV relativeFrom="paragraph">
+              <wp:posOffset>3578750</wp:posOffset>
+            </wp:positionV>
+            <wp:extent cx="5759450" cy="3163570"/>
+            <wp:effectExtent l="19050" t="19050" r="12700" b="17780"/>
+            <wp:wrapTopAndBottom/>
+            <wp:docPr id="5" name="Kép 5"/>
+            <wp:cNvGraphicFramePr>
+              <a:graphicFrameLocks xmlns:a="http://schemas.openxmlformats.org/drawingml/2006/main" noChangeAspect="1"/>
+            </wp:cNvGraphicFramePr>
+            <a:graphic xmlns:a="http://schemas.openxmlformats.org/drawingml/2006/main">
+              <a:graphicData uri="http://schemas.openxmlformats.org/drawingml/2006/picture">
+                <pic:pic xmlns:pic="http://schemas.openxmlformats.org/drawingml/2006/picture">
+                  <pic:nvPicPr>
+                    <pic:cNvPr id="0" name="Picture 13"/>
+                    <pic:cNvPicPr>
+                      <a:picLocks noChangeAspect="1" noChangeArrowheads="1"/>
+                    </pic:cNvPicPr>
+                  </pic:nvPicPr>
+                  <pic:blipFill>
+                    <a:blip r:embed="rId40">
+                      <a:extLst>
+                        <a:ext uri="{28A0092B-C50C-407E-A947-70E740481C1C}">
+                          <a14:useLocalDpi xmlns:a14="http://schemas.microsoft.com/office/drawing/2010/main" val="0"/>
+                        </a:ext>
+                      </a:extLst>
+                    </a:blip>
+                    <a:srcRect/>
+                    <a:stretch>
+                      <a:fillRect/>
+                    </a:stretch>
+                  </pic:blipFill>
+                  <pic:spPr bwMode="auto">
+                    <a:xfrm>
+                      <a:off x="0" y="0"/>
+                      <a:ext cx="5759450" cy="3163570"/>
+                    </a:xfrm>
+                    <a:prstGeom prst="rect">
+                      <a:avLst/>
+                    </a:prstGeom>
+                    <a:noFill/>
+                    <a:ln>
+                      <a:solidFill>
+                        <a:schemeClr val="tx1"/>
+                      </a:solidFill>
+                    </a:ln>
+                  </pic:spPr>
+                </pic:pic>
+              </a:graphicData>
+            </a:graphic>
+          </wp:anchor>
+        </w:drawing>
+      </w:r>
+      <w:r>
+        <w:rPr>
+          <w:noProof/>
+        </w:rPr>
+        <mc:AlternateContent>
+          <mc:Choice Requires="wps">
+            <w:drawing>
+              <wp:anchor distT="0" distB="0" distL="114300" distR="114300" simplePos="0" relativeHeight="251727872" behindDoc="1" locked="0" layoutInCell="1" allowOverlap="1" wp14:anchorId="69795334" wp14:editId="44F7134E">
+                <wp:simplePos x="0" y="0"/>
+                <wp:positionH relativeFrom="margin">
+                  <wp:posOffset>3175</wp:posOffset>
+                </wp:positionH>
+                <wp:positionV relativeFrom="paragraph">
+                  <wp:posOffset>3341370</wp:posOffset>
+                </wp:positionV>
+                <wp:extent cx="5743575" cy="635"/>
+                <wp:effectExtent l="0" t="0" r="9525" b="11430"/>
+                <wp:wrapTopAndBottom/>
+                <wp:docPr id="6" name="Szövegdoboz 1"/>
+                <wp:cNvGraphicFramePr/>
+                <a:graphic xmlns:a="http://schemas.openxmlformats.org/drawingml/2006/main">
+                  <a:graphicData uri="http://schemas.microsoft.com/office/word/2010/wordprocessingShape">
+                    <wps:wsp>
+                      <wps:cNvSpPr txBox="1"/>
+                      <wps:spPr>
+                        <a:xfrm>
+                          <a:off x="0" y="0"/>
+                          <a:ext cx="5743575" cy="635"/>
+                        </a:xfrm>
+                        <a:prstGeom prst="rect">
+                          <a:avLst/>
+                        </a:prstGeom>
+                        <a:noFill/>
+                        <a:ln>
+                          <a:noFill/>
+                        </a:ln>
+                      </wps:spPr>
+                      <wps:txbx>
+                        <w:txbxContent>
+                          <w:p>
+                            <w:pPr>
+                              <w:pStyle w:val="Kpalrs"/>
+                              <w:jc w:val="center"/>
+                            </w:pPr>
+                            <w:r>
+                              <w:t>1</w:t>
+                            </w:r>
+                            <w:r>
+                              <w:t>4</w:t>
+                            </w:r>
+                            <w:r>
+                              <w:t>.</w:t>
+                            </w:r>
+                            <w:r>
+                              <w:t>2</w:t>
+                            </w:r>
+                            <w:r>
+                              <w:t>.</w:t>
+                            </w:r>
+                            <w:r>
+                              <w:t xml:space="preserve"> ábra</w:t>
+                            </w:r>
+                            <w:r>
+                              <w:t>: Bolti telephely</w:t>
+                            </w:r>
+                            <w:r>
+                              <w:t xml:space="preserve"> felhasználói</w:t>
+                            </w:r>
+                          </w:p>
+                        </w:txbxContent>
+                      </wps:txbx>
+                      <wps:bodyPr rot="0" spcFirstLastPara="0" vertOverflow="overflow" horzOverflow="overflow" vert="horz" wrap="square" lIns="0" tIns="0" rIns="0" bIns="0" numCol="1" spcCol="0" rtlCol="0" fromWordArt="0" anchor="t" anchorCtr="0" forceAA="0" compatLnSpc="1">
+                        <a:prstTxWarp prst="textNoShape">
+                          <a:avLst/>
+                        </a:prstTxWarp>
+                        <a:spAutoFit/>
+                      </wps:bodyPr>
+                    </wps:wsp>
+                  </a:graphicData>
+                </a:graphic>
+                <wp14:sizeRelH relativeFrom="margin">
+                  <wp14:pctWidth>0</wp14:pctWidth>
+                </wp14:sizeRelH>
+                <wp14:sizeRelV relativeFrom="margin">
+                  <wp14:pctHeight>0</wp14:pctHeight>
+                </wp14:sizeRelV>
+              </wp:anchor>
+            </w:drawing>
+          </mc:Choice>
+          <mc:Fallback>
+            <w:pict>
+              <v:shape w14:anchorId="69795334" id="_x0000_s1050" type="#_x0000_t202" style="position:absolute;margin-left:.25pt;margin-top:263.1pt;width:452.25pt;height:.05pt;z-index:-251588608;visibility:visible;mso-wrap-style:square;mso-width-percent:0;mso-height-percent:0;mso-wrap-distance-left:9pt;mso-wrap-distance-top:0;mso-wrap-distance-right:9pt;mso-wrap-distance-bottom:0;mso-position-horizontal:absolute;mso-position-horizontal-relative:margin;mso-position-vertical:absolute;mso-position-vertical-relative:text;mso-width-percent:0;mso-height-percent:0;mso-width-relative:margin;mso-height-relative:margin;v-text-anchor:top" o:gfxdata="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" filled="f" stroked="f">
+                <v:textbox style="mso-fit-shape-to-text:t" inset="0,0,0,0">
+                  <w:txbxContent>
+                    <w:p>
+                      <w:pPr>
+                        <w:pStyle w:val="Kpalrs"/>
+                        <w:jc w:val="center"/>
+                      </w:pPr>
+                      <w:r>
+                        <w:t>1</w:t>
+                      </w:r>
+                      <w:r>
+                        <w:t>4</w:t>
+                      </w:r>
+                      <w:r>
+                        <w:t>.</w:t>
+                      </w:r>
+                      <w:r>
+                        <w:t>2</w:t>
+                      </w:r>
+                      <w:r>
+                        <w:t>.</w:t>
+                      </w:r>
+                      <w:r>
+                        <w:t xml:space="preserve"> ábra</w:t>
+                      </w:r>
+                      <w:r>
+                        <w:t>: Bolti telephely</w:t>
+                      </w:r>
+                      <w:r>
+                        <w:t xml:space="preserve"> felhasználói</w:t>
+                      </w:r>
+                    </w:p>
+                  </w:txbxContent>
+                </v:textbox>
+                <w10:wrap type="topAndBottom" anchorx="margin"/>
+              </v:shape>
+            </w:pict>
+          </mc:Fallback>
+        </mc:AlternateContent>
+      </w:r>
+      <w:r>
+        <w:rPr>
+          <w:noProof/>
+        </w:rPr>
+        <w:drawing>
+          <wp:anchor distT="0" distB="0" distL="114300" distR="114300" simplePos="0" relativeHeight="251730944" behindDoc="0" locked="0" layoutInCell="1" allowOverlap="1" wp14:anchorId="74C30392" wp14:editId="24D760A5">
+            <wp:simplePos x="0" y="0"/>
+            <wp:positionH relativeFrom="column">
+              <wp:posOffset>3337</wp:posOffset>
+            </wp:positionH>
+            <wp:positionV relativeFrom="paragraph">
+              <wp:posOffset>250840</wp:posOffset>
+            </wp:positionV>
+            <wp:extent cx="5759450" cy="3143250"/>
+            <wp:effectExtent l="19050" t="19050" r="12700" b="19050"/>
+            <wp:wrapTopAndBottom/>
+            <wp:docPr id="7" name="Kép 7"/>
+            <wp:cNvGraphicFramePr>
+              <a:graphicFrameLocks xmlns:a="http://schemas.openxmlformats.org/drawingml/2006/main" noChangeAspect="1"/>
+            </wp:cNvGraphicFramePr>
+            <a:graphic xmlns:a="http://schemas.openxmlformats.org/drawingml/2006/main">
+              <a:graphicData uri="http://schemas.openxmlformats.org/drawingml/2006/picture">
+                <pic:pic xmlns:pic="http://schemas.openxmlformats.org/drawingml/2006/picture">
+                  <pic:nvPicPr>
+                    <pic:cNvPr id="0" name="Picture 15"/>
+                    <pic:cNvPicPr>
+                      <a:picLocks noChangeAspect="1" noChangeArrowheads="1"/>
+                    </pic:cNvPicPr>
+                  </pic:nvPicPr>
+                  <pic:blipFill>
+                    <a:blip r:embed="rId41">
+                      <a:extLst>
+                        <a:ext uri="{28A0092B-C50C-407E-A947-70E740481C1C}">
+                          <a14:useLocalDpi xmlns:a14="http://schemas.microsoft.com/office/drawing/2010/main" val="0"/>
+                        </a:ext>
+                      </a:extLst>
+                    </a:blip>
+                    <a:srcRect/>
+                    <a:stretch>
+                      <a:fillRect/>
+                    </a:stretch>
+                  </pic:blipFill>
+                  <pic:spPr bwMode="auto">
+                    <a:xfrm>
+                      <a:off x="0" y="0"/>
+                      <a:ext cx="5759450" cy="3143250"/>
+                    </a:xfrm>
+                    <a:prstGeom prst="rect">
+                      <a:avLst/>
+                    </a:prstGeom>
+                    <a:noFill/>
+                    <a:ln>
+                      <a:solidFill>
+                        <a:schemeClr val="tx1"/>
+                      </a:solidFill>
+                    </a:ln>
+                  </pic:spPr>
+                </pic:pic>
+              </a:graphicData>
+            </a:graphic>
+          </wp:anchor>
+        </w:drawing>
+      </w:r>
+    </w:p>
+    <w:p>
+      <w:pPr>
+        <w:spacing w:before="100" w:beforeAutospacing="1" w:after="100" w:afterAutospacing="1" w:line="240" w:lineRule="auto"/>
+        <w:jc w:val="left"/>
+        <w:rPr>
+          <w:rFonts w:eastAsia="Times New Roman" w:cs="Times New Roman"/>
+          <w:szCs w:val="24"/>
+          <w:lang w:val="hu-HU" w:eastAsia="hu-HU"/>
+        </w:rPr>
+      </w:pPr>
+      <w:r>
+        <w:rPr>
+          <w:noProof/>
+        </w:rPr>
+        <w:lastRenderedPageBreak/>
+        <mc:AlternateContent>
+          <mc:Choice Requires="wps">
+            <w:drawing>
+              <wp:anchor distT="0" distB="0" distL="114300" distR="114300" simplePos="0" relativeHeight="251732992" behindDoc="1" locked="0" layoutInCell="1" allowOverlap="1" wp14:anchorId="14E0BB5B" wp14:editId="788EF9B2">
+                <wp:simplePos x="0" y="0"/>
+                <wp:positionH relativeFrom="margin">
+                  <wp:align>right</wp:align>
+                </wp:positionH>
+                <wp:positionV relativeFrom="paragraph">
+                  <wp:posOffset>3759835</wp:posOffset>
+                </wp:positionV>
+                <wp:extent cx="5743575" cy="635"/>
+                <wp:effectExtent l="0" t="0" r="9525" b="11430"/>
+                <wp:wrapTight wrapText="bothSides">
+                  <wp:wrapPolygon edited="0">
+                    <wp:start x="0" y="0"/>
+                    <wp:lineTo x="0" y="21000"/>
+                    <wp:lineTo x="21564" y="21000"/>
+                    <wp:lineTo x="21564" y="0"/>
+                    <wp:lineTo x="0" y="0"/>
+                  </wp:wrapPolygon>
+                </wp:wrapTight>
+                <wp:docPr id="10" name="Szövegdoboz 1"/>
+                <wp:cNvGraphicFramePr/>
+                <a:graphic xmlns:a="http://schemas.openxmlformats.org/drawingml/2006/main">
+                  <a:graphicData uri="http://schemas.microsoft.com/office/word/2010/wordprocessingShape">
+                    <wps:wsp>
+                      <wps:cNvSpPr txBox="1"/>
+                      <wps:spPr>
+                        <a:xfrm>
+                          <a:off x="0" y="0"/>
+                          <a:ext cx="5743575" cy="635"/>
+                        </a:xfrm>
+                        <a:prstGeom prst="rect">
+                          <a:avLst/>
+                        </a:prstGeom>
+                        <a:noFill/>
+                        <a:ln>
+                          <a:noFill/>
+                        </a:ln>
+                      </wps:spPr>
+                      <wps:txbx>
+                        <w:txbxContent>
+                          <w:p>
+                            <w:pPr>
+                              <w:pStyle w:val="Kpalrs"/>
+                              <w:jc w:val="center"/>
+                            </w:pPr>
+                            <w:r>
+                              <w:t>1</w:t>
+                            </w:r>
+                            <w:r>
+                              <w:t>4</w:t>
+                            </w:r>
+                            <w:r>
+                              <w:t>.</w:t>
+                            </w:r>
+                            <w:r>
+                              <w:t>4</w:t>
+                            </w:r>
+                            <w:r>
+                              <w:t>.</w:t>
+                            </w:r>
+                            <w:r>
+                              <w:t xml:space="preserve"> ábra</w:t>
+                            </w:r>
+                            <w:r>
+                              <w:t>:</w:t>
+                            </w:r>
+                            <w:r>
+                              <w:t>Központ</w:t>
+                            </w:r>
+                            <w:r>
+                              <w:t xml:space="preserve"> telephely </w:t>
+                            </w:r>
+                            <w:r>
+                              <w:t>eszközei</w:t>
+                            </w:r>
+                          </w:p>
+                        </w:txbxContent>
+                      </wps:txbx>
+                      <wps:bodyPr rot="0" spcFirstLastPara="0" vertOverflow="overflow" horzOverflow="overflow" vert="horz" wrap="square" lIns="0" tIns="0" rIns="0" bIns="0" numCol="1" spcCol="0" rtlCol="0" fromWordArt="0" anchor="t" anchorCtr="0" forceAA="0" compatLnSpc="1">
+                        <a:prstTxWarp prst="textNoShape">
+                          <a:avLst/>
+                        </a:prstTxWarp>
+                        <a:spAutoFit/>
+                      </wps:bodyPr>
+                    </wps:wsp>
+                  </a:graphicData>
+                </a:graphic>
+                <wp14:sizeRelH relativeFrom="margin">
+                  <wp14:pctWidth>0</wp14:pctWidth>
+                </wp14:sizeRelH>
+                <wp14:sizeRelV relativeFrom="margin">
+                  <wp14:pctHeight>0</wp14:pctHeight>
+                </wp14:sizeRelV>
+              </wp:anchor>
+            </w:drawing>
+          </mc:Choice>
+          <mc:Fallback>
+            <w:pict>
+              <v:shape w14:anchorId="14E0BB5B" id="_x0000_s1051" type="#_x0000_t202" style="position:absolute;margin-left:401.05pt;margin-top:296.05pt;width:452.25pt;height:.05pt;z-index:-251583488;visibility:visible;mso-wrap-style:square;mso-width-percent:0;mso-height-percent:0;mso-wrap-distance-left:9pt;mso-wrap-distance-top:0;mso-wrap-distance-right:9pt;mso-wrap-distance-bottom:0;mso-position-horizontal:right;mso-position-horizontal-relative:margin;mso-position-vertical:absolute;mso-position-vertical-relative:text;mso-width-percent:0;mso-height-percent:0;mso-width-relative:margin;mso-height-relative:margin;v-text-anchor:top" o:gfxdata="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" filled="f" stroked="f">
+                <v:textbox style="mso-fit-shape-to-text:t" inset="0,0,0,0">
+                  <w:txbxContent>
+                    <w:p>
+                      <w:pPr>
+                        <w:pStyle w:val="Kpalrs"/>
+                        <w:jc w:val="center"/>
+                      </w:pPr>
+                      <w:r>
+                        <w:t>1</w:t>
+                      </w:r>
+                      <w:r>
+                        <w:t>4</w:t>
+                      </w:r>
+                      <w:r>
+                        <w:t>.</w:t>
+                      </w:r>
+                      <w:r>
+                        <w:t>4</w:t>
+                      </w:r>
+                      <w:r>
+                        <w:t>.</w:t>
+                      </w:r>
+                      <w:r>
+                        <w:t xml:space="preserve"> ábra</w:t>
+                      </w:r>
+                      <w:r>
+                        <w:t>:</w:t>
+                      </w:r>
+                      <w:r>
+                        <w:t>Központ</w:t>
+                      </w:r>
+                      <w:r>
+                        <w:t xml:space="preserve"> telephely </w:t>
+                      </w:r>
+                      <w:r>
+                        <w:t>eszközei</w:t>
+                      </w:r>
+                    </w:p>
+                  </w:txbxContent>
+                </v:textbox>
+                <w10:wrap type="tight" anchorx="margin"/>
+              </v:shape>
+            </w:pict>
+          </mc:Fallback>
+        </mc:AlternateContent>
+      </w:r>
+      <w:r>
+        <w:rPr>
+          <w:noProof/>
+        </w:rPr>
+        <w:drawing>
+          <wp:anchor distT="0" distB="0" distL="114300" distR="114300" simplePos="0" relativeHeight="251738112" behindDoc="1" locked="0" layoutInCell="1" allowOverlap="1" wp14:anchorId="163990CE" wp14:editId="5AE2600D">
+            <wp:simplePos x="0" y="0"/>
+            <wp:positionH relativeFrom="margin">
+              <wp:align>left</wp:align>
+            </wp:positionH>
+            <wp:positionV relativeFrom="paragraph">
+              <wp:posOffset>4135755</wp:posOffset>
+            </wp:positionV>
+            <wp:extent cx="5759450" cy="3198495"/>
+            <wp:effectExtent l="19050" t="19050" r="12700" b="20955"/>
+            <wp:wrapThrough wrapText="bothSides">
+              <wp:wrapPolygon edited="0">
+                <wp:start x="-71" y="-129"/>
+                <wp:lineTo x="-71" y="21613"/>
+                <wp:lineTo x="21576" y="21613"/>
+                <wp:lineTo x="21576" y="-129"/>
+                <wp:lineTo x="-71" y="-129"/>
+              </wp:wrapPolygon>
+            </wp:wrapThrough>
+            <wp:docPr id="11" name="Kép 11"/>
+            <wp:cNvGraphicFramePr>
+              <a:graphicFrameLocks xmlns:a="http://schemas.openxmlformats.org/drawingml/2006/main" noChangeAspect="1"/>
+            </wp:cNvGraphicFramePr>
+            <a:graphic xmlns:a="http://schemas.openxmlformats.org/drawingml/2006/main">
+              <a:graphicData uri="http://schemas.openxmlformats.org/drawingml/2006/picture">
+                <pic:pic xmlns:pic="http://schemas.openxmlformats.org/drawingml/2006/picture">
+                  <pic:nvPicPr>
+                    <pic:cNvPr id="0" name="Picture 19"/>
+                    <pic:cNvPicPr>
+                      <a:picLocks noChangeAspect="1" noChangeArrowheads="1"/>
+                    </pic:cNvPicPr>
+                  </pic:nvPicPr>
+                  <pic:blipFill>
+                    <a:blip r:embed="rId42">
+                      <a:extLst>
+                        <a:ext uri="{28A0092B-C50C-407E-A947-70E740481C1C}">
+                          <a14:useLocalDpi xmlns:a14="http://schemas.microsoft.com/office/drawing/2010/main" val="0"/>
+                        </a:ext>
+                      </a:extLst>
+                    </a:blip>
+                    <a:srcRect/>
+                    <a:stretch>
+                      <a:fillRect/>
+                    </a:stretch>
+                  </pic:blipFill>
+                  <pic:spPr bwMode="auto">
+                    <a:xfrm>
+                      <a:off x="0" y="0"/>
+                      <a:ext cx="5759450" cy="3198495"/>
+                    </a:xfrm>
+                    <a:prstGeom prst="rect">
+                      <a:avLst/>
+                    </a:prstGeom>
+                    <a:noFill/>
+                    <a:ln>
+                      <a:solidFill>
+                        <a:schemeClr val="tx1"/>
+                      </a:solidFill>
+                    </a:ln>
+                  </pic:spPr>
+                </pic:pic>
+              </a:graphicData>
+            </a:graphic>
+          </wp:anchor>
+        </w:drawing>
+      </w:r>
+      <w:r>
+        <w:rPr>
+          <w:noProof/>
+        </w:rPr>
+        <mc:AlternateContent>
+          <mc:Choice Requires="wps">
+            <w:drawing>
+              <wp:anchor distT="0" distB="0" distL="114300" distR="114300" simplePos="0" relativeHeight="251737088" behindDoc="1" locked="0" layoutInCell="1" allowOverlap="1" wp14:anchorId="46D5B6B4" wp14:editId="172E280B">
+                <wp:simplePos x="0" y="0"/>
+                <wp:positionH relativeFrom="margin">
+                  <wp:align>right</wp:align>
+                </wp:positionH>
+                <wp:positionV relativeFrom="paragraph">
+                  <wp:posOffset>7287895</wp:posOffset>
+                </wp:positionV>
+                <wp:extent cx="5743575" cy="635"/>
+                <wp:effectExtent l="0" t="0" r="9525" b="11430"/>
+                <wp:wrapTight wrapText="bothSides">
+                  <wp:wrapPolygon edited="0">
+                    <wp:start x="0" y="0"/>
+                    <wp:lineTo x="0" y="21000"/>
+                    <wp:lineTo x="21564" y="21000"/>
+                    <wp:lineTo x="21564" y="0"/>
+                    <wp:lineTo x="0" y="0"/>
+                  </wp:wrapPolygon>
+                </wp:wrapTight>
+                <wp:docPr id="14" name="Szövegdoboz 1"/>
+                <wp:cNvGraphicFramePr/>
+                <a:graphic xmlns:a="http://schemas.openxmlformats.org/drawingml/2006/main">
+                  <a:graphicData uri="http://schemas.microsoft.com/office/word/2010/wordprocessingShape">
+                    <wps:wsp>
+                      <wps:cNvSpPr txBox="1"/>
+                      <wps:spPr>
+                        <a:xfrm>
+                          <a:off x="0" y="0"/>
+                          <a:ext cx="5743575" cy="635"/>
+                        </a:xfrm>
+                        <a:prstGeom prst="rect">
+                          <a:avLst/>
+                        </a:prstGeom>
+                        <a:noFill/>
+                        <a:ln>
+                          <a:noFill/>
+                        </a:ln>
+                      </wps:spPr>
+                      <wps:txbx>
+                        <w:txbxContent>
+                          <w:p>
+                            <w:pPr>
+                              <w:pStyle w:val="Kpalrs"/>
+                              <w:jc w:val="center"/>
+                            </w:pPr>
+                            <w:r>
+                              <w:t>1</w:t>
+                            </w:r>
+                            <w:r>
+                              <w:t>4</w:t>
+                            </w:r>
+                            <w:r>
+                              <w:t>.</w:t>
+                            </w:r>
+                            <w:r>
+                              <w:t>5</w:t>
+                            </w:r>
+                            <w:r>
+                              <w:t>.</w:t>
+                            </w:r>
+                            <w:r>
+                              <w:t xml:space="preserve"> ábra</w:t>
+                            </w:r>
+                            <w:r>
+                              <w:t>:Központ telephely csoportjai</w:t>
+                            </w:r>
+                          </w:p>
+                        </w:txbxContent>
+                      </wps:txbx>
+                      <wps:bodyPr rot="0" spcFirstLastPara="0" vertOverflow="overflow" horzOverflow="overflow" vert="horz" wrap="square" lIns="0" tIns="0" rIns="0" bIns="0" numCol="1" spcCol="0" rtlCol="0" fromWordArt="0" anchor="t" anchorCtr="0" forceAA="0" compatLnSpc="1">
+                        <a:prstTxWarp prst="textNoShape">
+                          <a:avLst/>
+                        </a:prstTxWarp>
+                        <a:spAutoFit/>
+                      </wps:bodyPr>
+                    </wps:wsp>
+                  </a:graphicData>
+                </a:graphic>
+                <wp14:sizeRelH relativeFrom="margin">
+                  <wp14:pctWidth>0</wp14:pctWidth>
+                </wp14:sizeRelH>
+                <wp14:sizeRelV relativeFrom="margin">
+                  <wp14:pctHeight>0</wp14:pctHeight>
+                </wp14:sizeRelV>
+              </wp:anchor>
+            </w:drawing>
+          </mc:Choice>
+          <mc:Fallback>
+            <w:pict>
+              <v:shape w14:anchorId="46D5B6B4" id="_x0000_s1052" type="#_x0000_t202" style="position:absolute;margin-left:401.05pt;margin-top:573.85pt;width:452.25pt;height:.05pt;z-index:-251579392;visibility:visible;mso-wrap-style:square;mso-width-percent:0;mso-height-percent:0;mso-wrap-distance-left:9pt;mso-wrap-distance-top:0;mso-wrap-distance-right:9pt;mso-wrap-distance-bottom:0;mso-position-horizontal:right;mso-position-horizontal-relative:margin;mso-position-vertical:absolute;mso-position-vertical-relative:text;mso-width-percent:0;mso-height-percent:0;mso-width-relative:margin;mso-height-relative:margin;v-text-anchor:top" o:gfxdata="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" filled="f" stroked="f">
+                <v:textbox style="mso-fit-shape-to-text:t" inset="0,0,0,0">
+                  <w:txbxContent>
+                    <w:p>
+                      <w:pPr>
+                        <w:pStyle w:val="Kpalrs"/>
+                        <w:jc w:val="center"/>
+                      </w:pPr>
+                      <w:r>
+                        <w:t>1</w:t>
+                      </w:r>
+                      <w:r>
+                        <w:t>4</w:t>
+                      </w:r>
+                      <w:r>
+                        <w:t>.</w:t>
+                      </w:r>
+                      <w:r>
+                        <w:t>5</w:t>
+                      </w:r>
+                      <w:r>
+                        <w:t>.</w:t>
+                      </w:r>
+                      <w:r>
+                        <w:t xml:space="preserve"> ábra</w:t>
+                      </w:r>
+                      <w:r>
+                        <w:t>:Központ telephely csoportjai</w:t>
+                      </w:r>
+                    </w:p>
+                  </w:txbxContent>
+                </v:textbox>
+                <w10:wrap type="tight" anchorx="margin"/>
+              </v:shape>
+            </w:pict>
+          </mc:Fallback>
+        </mc:AlternateContent>
+      </w:r>
+      <w:r>
+        <w:rPr>
+          <w:noProof/>
+        </w:rPr>
+        <w:drawing>
+          <wp:inline distT="0" distB="0" distL="0" distR="0" wp14:anchorId="15F33878" wp14:editId="25EF81B4">
+            <wp:extent cx="5759450" cy="3712210"/>
+            <wp:effectExtent l="19050" t="19050" r="12700" b="21590"/>
+            <wp:docPr id="9" name="Kép 9"/>
+            <wp:cNvGraphicFramePr>
+              <a:graphicFrameLocks xmlns:a="http://schemas.openxmlformats.org/drawingml/2006/main" noChangeAspect="1"/>
+            </wp:cNvGraphicFramePr>
+            <a:graphic xmlns:a="http://schemas.openxmlformats.org/drawingml/2006/main">
+              <a:graphicData uri="http://schemas.openxmlformats.org/drawingml/2006/picture">
+                <pic:pic xmlns:pic="http://schemas.openxmlformats.org/drawingml/2006/picture">
+                  <pic:nvPicPr>
+                    <pic:cNvPr id="0" name="Picture 17"/>
+                    <pic:cNvPicPr>
+                      <a:picLocks noChangeAspect="1" noChangeArrowheads="1"/>
+                    </pic:cNvPicPr>
+                  </pic:nvPicPr>
+                  <pic:blipFill>
+                    <a:blip r:embed="rId43">
+                      <a:extLst>
+                        <a:ext uri="{28A0092B-C50C-407E-A947-70E740481C1C}">
+                          <a14:useLocalDpi xmlns:a14="http://schemas.microsoft.com/office/drawing/2010/main" val="0"/>
+                        </a:ext>
+                      </a:extLst>
+                    </a:blip>
+                    <a:srcRect/>
+                    <a:stretch>
+                      <a:fillRect/>
+                    </a:stretch>
+                  </pic:blipFill>
+                  <pic:spPr bwMode="auto">
+                    <a:xfrm>
+                      <a:off x="0" y="0"/>
+                      <a:ext cx="5759450" cy="3712210"/>
+                    </a:xfrm>
+                    <a:prstGeom prst="rect">
+                      <a:avLst/>
+                    </a:prstGeom>
+                    <a:noFill/>
+                    <a:ln>
+                      <a:solidFill>
+                        <a:schemeClr val="tx1"/>
+                      </a:solidFill>
+                    </a:ln>
+                  </pic:spPr>
+                </pic:pic>
+              </a:graphicData>
+            </a:graphic>
+          </wp:inline>
+        </w:drawing>
+      </w:r>
+    </w:p>
+    <w:p>
+      <w:pPr>
+        <w:spacing w:before="100" w:beforeAutospacing="1" w:after="100" w:afterAutospacing="1" w:line="240" w:lineRule="auto"/>
+        <w:jc w:val="left"/>
+        <w:rPr>
+          <w:rFonts w:eastAsia="Times New Roman" w:cs="Times New Roman"/>
+          <w:szCs w:val="24"/>
+          <w:lang w:val="hu-HU" w:eastAsia="hu-HU"/>
+        </w:rPr>
+      </w:pPr>
+      <w:r>
+        <w:rPr>
+          <w:noProof/>
+        </w:rPr>
+        <w:lastRenderedPageBreak/>
+        <mc:AlternateContent>
+          <mc:Choice Requires="wps">
+            <w:drawing>
+              <wp:anchor distT="0" distB="0" distL="114300" distR="114300" simplePos="0" relativeHeight="251742208" behindDoc="1" locked="0" layoutInCell="1" allowOverlap="1" wp14:anchorId="4922B0C3" wp14:editId="2DCB47F9">
+                <wp:simplePos x="0" y="0"/>
+                <wp:positionH relativeFrom="margin">
+                  <wp:align>right</wp:align>
+                </wp:positionH>
+                <wp:positionV relativeFrom="paragraph">
+                  <wp:posOffset>6800850</wp:posOffset>
+                </wp:positionV>
+                <wp:extent cx="5743575" cy="635"/>
+                <wp:effectExtent l="0" t="0" r="9525" b="11430"/>
+                <wp:wrapTopAndBottom/>
+                <wp:docPr id="18" name="Szövegdoboz 1"/>
+                <wp:cNvGraphicFramePr/>
+                <a:graphic xmlns:a="http://schemas.openxmlformats.org/drawingml/2006/main">
+                  <a:graphicData uri="http://schemas.microsoft.com/office/word/2010/wordprocessingShape">
+                    <wps:wsp>
+                      <wps:cNvSpPr txBox="1"/>
+                      <wps:spPr>
+                        <a:xfrm>
+                          <a:off x="0" y="0"/>
+                          <a:ext cx="5743575" cy="635"/>
+                        </a:xfrm>
+                        <a:prstGeom prst="rect">
+                          <a:avLst/>
+                        </a:prstGeom>
+                        <a:noFill/>
+                        <a:ln>
+                          <a:noFill/>
+                        </a:ln>
+                      </wps:spPr>
+                      <wps:txbx>
+                        <w:txbxContent>
+                          <w:p>
+                            <w:pPr>
+                              <w:pStyle w:val="Kpalrs"/>
+                              <w:jc w:val="center"/>
+                            </w:pPr>
+                            <w:r>
+                              <w:t>14.</w:t>
+                            </w:r>
+                            <w:r>
+                              <w:t>7.</w:t>
+                            </w:r>
+                            <w:r>
+                              <w:t xml:space="preserve"> ábra</w:t>
+                            </w:r>
+                            <w:r>
+                              <w:t>:</w:t>
+                            </w:r>
+                            <w:r>
+                              <w:t xml:space="preserve"> Bolti felhasználó sikeres beléptetése</w:t>
+                            </w:r>
+                          </w:p>
+                        </w:txbxContent>
+                      </wps:txbx>
+                      <wps:bodyPr rot="0" spcFirstLastPara="0" vertOverflow="overflow" horzOverflow="overflow" vert="horz" wrap="square" lIns="0" tIns="0" rIns="0" bIns="0" numCol="1" spcCol="0" rtlCol="0" fromWordArt="0" anchor="t" anchorCtr="0" forceAA="0" compatLnSpc="1">
+                        <a:prstTxWarp prst="textNoShape">
+                          <a:avLst/>
+                        </a:prstTxWarp>
+                        <a:spAutoFit/>
+                      </wps:bodyPr>
+                    </wps:wsp>
+                  </a:graphicData>
+                </a:graphic>
+                <wp14:sizeRelH relativeFrom="margin">
+                  <wp14:pctWidth>0</wp14:pctWidth>
+                </wp14:sizeRelH>
+                <wp14:sizeRelV relativeFrom="margin">
+                  <wp14:pctHeight>0</wp14:pctHeight>
+                </wp14:sizeRelV>
+              </wp:anchor>
+            </w:drawing>
+          </mc:Choice>
+          <mc:Fallback>
+            <w:pict>
+              <v:shape w14:anchorId="4922B0C3" id="_x0000_s1053" type="#_x0000_t202" style="position:absolute;margin-left:401.05pt;margin-top:535.5pt;width:452.25pt;height:.05pt;z-index:-251574272;visibility:visible;mso-wrap-style:square;mso-width-percent:0;mso-height-percent:0;mso-wrap-distance-left:9pt;mso-wrap-distance-top:0;mso-wrap-distance-right:9pt;mso-wrap-distance-bottom:0;mso-position-horizontal:right;mso-position-horizontal-relative:margin;mso-position-vertical:absolute;mso-position-vertical-relative:text;mso-width-percent:0;mso-height-percent:0;mso-width-relative:margin;mso-height-relative:margin;v-text-anchor:top" o:gfxdata="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" filled="f" stroked="f">
+                <v:textbox style="mso-fit-shape-to-text:t" inset="0,0,0,0">
+                  <w:txbxContent>
+                    <w:p>
+                      <w:pPr>
+                        <w:pStyle w:val="Kpalrs"/>
+                        <w:jc w:val="center"/>
+                      </w:pPr>
+                      <w:r>
+                        <w:t>14.</w:t>
+                      </w:r>
+                      <w:r>
+                        <w:t>7.</w:t>
+                      </w:r>
+                      <w:r>
+                        <w:t xml:space="preserve"> ábra</w:t>
+                      </w:r>
+                      <w:r>
+                        <w:t>:</w:t>
+                      </w:r>
+                      <w:r>
+                        <w:t xml:space="preserve"> Bolti felhasználó sikeres beléptetése</w:t>
+                      </w:r>
+                    </w:p>
+                  </w:txbxContent>
+                </v:textbox>
+                <w10:wrap type="topAndBottom" anchorx="margin"/>
+              </v:shape>
+            </w:pict>
+          </mc:Fallback>
+        </mc:AlternateContent>
+      </w:r>
+      <w:r>
+        <w:rPr>
+          <w:noProof/>
+        </w:rPr>
+        <mc:AlternateContent>
+          <mc:Choice Requires="wps">
+            <w:drawing>
+              <wp:anchor distT="0" distB="0" distL="114300" distR="114300" simplePos="0" relativeHeight="251735040" behindDoc="1" locked="0" layoutInCell="1" allowOverlap="1" wp14:anchorId="141456F0" wp14:editId="51DFFCB6">
+                <wp:simplePos x="0" y="0"/>
+                <wp:positionH relativeFrom="margin">
+                  <wp:align>right</wp:align>
+                </wp:positionH>
+                <wp:positionV relativeFrom="paragraph">
+                  <wp:posOffset>3232785</wp:posOffset>
+                </wp:positionV>
+                <wp:extent cx="5743575" cy="635"/>
+                <wp:effectExtent l="0" t="0" r="9525" b="11430"/>
+                <wp:wrapTopAndBottom/>
+                <wp:docPr id="12" name="Szövegdoboz 1"/>
+                <wp:cNvGraphicFramePr/>
+                <a:graphic xmlns:a="http://schemas.openxmlformats.org/drawingml/2006/main">
+                  <a:graphicData uri="http://schemas.microsoft.com/office/word/2010/wordprocessingShape">
+                    <wps:wsp>
+                      <wps:cNvSpPr txBox="1"/>
+                      <wps:spPr>
+                        <a:xfrm>
+                          <a:off x="0" y="0"/>
+                          <a:ext cx="5743575" cy="635"/>
+                        </a:xfrm>
+                        <a:prstGeom prst="rect">
+                          <a:avLst/>
+                        </a:prstGeom>
+                        <a:noFill/>
+                        <a:ln>
+                          <a:noFill/>
+                        </a:ln>
+                      </wps:spPr>
+                      <wps:txbx>
+                        <w:txbxContent>
+                          <w:p>
+                            <w:pPr>
+                              <w:pStyle w:val="Kpalrs"/>
+                              <w:jc w:val="center"/>
+                            </w:pPr>
+                            <w:r>
+                              <w:t>1</w:t>
+                            </w:r>
+                            <w:r>
+                              <w:t>4</w:t>
+                            </w:r>
+                            <w:r>
+                              <w:t>.</w:t>
+                            </w:r>
+                            <w:r>
+                              <w:t>6</w:t>
+                            </w:r>
+                            <w:r>
+                              <w:t>.</w:t>
+                            </w:r>
+                            <w:r>
+                              <w:t xml:space="preserve"> ábra</w:t>
+                            </w:r>
+                            <w:r>
+                              <w:t>:</w:t>
+                            </w:r>
+                            <w:r>
+                              <w:t xml:space="preserve"> </w:t>
+                            </w:r>
+                            <w:r>
+                              <w:t xml:space="preserve">Központ telephely </w:t>
+                            </w:r>
+                            <w:r>
+                              <w:t>felhasználói</w:t>
+                            </w:r>
+                          </w:p>
+                        </w:txbxContent>
+                      </wps:txbx>
+                      <wps:bodyPr rot="0" spcFirstLastPara="0" vertOverflow="overflow" horzOverflow="overflow" vert="horz" wrap="square" lIns="0" tIns="0" rIns="0" bIns="0" numCol="1" spcCol="0" rtlCol="0" fromWordArt="0" anchor="t" anchorCtr="0" forceAA="0" compatLnSpc="1">
+                        <a:prstTxWarp prst="textNoShape">
+                          <a:avLst/>
+                        </a:prstTxWarp>
+                        <a:spAutoFit/>
+                      </wps:bodyPr>
+                    </wps:wsp>
+                  </a:graphicData>
+                </a:graphic>
+                <wp14:sizeRelH relativeFrom="margin">
+                  <wp14:pctWidth>0</wp14:pctWidth>
+                </wp14:sizeRelH>
+                <wp14:sizeRelV relativeFrom="margin">
+                  <wp14:pctHeight>0</wp14:pctHeight>
+                </wp14:sizeRelV>
+              </wp:anchor>
+            </w:drawing>
+          </mc:Choice>
+          <mc:Fallback>
+            <w:pict>
+              <v:shape w14:anchorId="141456F0" id="_x0000_s1054" type="#_x0000_t202" style="position:absolute;margin-left:401.05pt;margin-top:254.55pt;width:452.25pt;height:.05pt;z-index:-251581440;visibility:visible;mso-wrap-style:square;mso-width-percent:0;mso-height-percent:0;mso-wrap-distance-left:9pt;mso-wrap-distance-top:0;mso-wrap-distance-right:9pt;mso-wrap-distance-bottom:0;mso-position-horizontal:right;mso-position-horizontal-relative:margin;mso-position-vertical:absolute;mso-position-vertical-relative:text;mso-width-percent:0;mso-height-percent:0;mso-width-relative:margin;mso-height-relative:margin;v-text-anchor:top" o:gfxdata="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" filled="f" stroked="f">
+                <v:textbox style="mso-fit-shape-to-text:t" inset="0,0,0,0">
+                  <w:txbxContent>
+                    <w:p>
+                      <w:pPr>
+                        <w:pStyle w:val="Kpalrs"/>
+                        <w:jc w:val="center"/>
+                      </w:pPr>
+                      <w:r>
+                        <w:t>1</w:t>
+                      </w:r>
+                      <w:r>
+                        <w:t>4</w:t>
+                      </w:r>
+                      <w:r>
+                        <w:t>.</w:t>
+                      </w:r>
+                      <w:r>
+                        <w:t>6</w:t>
+                      </w:r>
+                      <w:r>
+                        <w:t>.</w:t>
+                      </w:r>
+                      <w:r>
+                        <w:t xml:space="preserve"> ábra</w:t>
+                      </w:r>
+                      <w:r>
+                        <w:t>:</w:t>
+                      </w:r>
+                      <w:r>
+                        <w:t xml:space="preserve"> </w:t>
+                      </w:r>
+                      <w:r>
+                        <w:t xml:space="preserve">Központ telephely </w:t>
+                      </w:r>
+                      <w:r>
+                        <w:t>felhasználói</w:t>
+                      </w:r>
+                    </w:p>
+                  </w:txbxContent>
+                </v:textbox>
+                <w10:wrap type="topAndBottom" anchorx="margin"/>
+              </v:shape>
+            </w:pict>
+          </mc:Fallback>
+        </mc:AlternateContent>
+      </w:r>
+      <w:r>
+        <w:rPr>
+          <w:noProof/>
+        </w:rPr>
+        <w:drawing>
+          <wp:inline distT="0" distB="0" distL="0" distR="0" wp14:anchorId="1CEAF576" wp14:editId="377A3707">
+            <wp:extent cx="5759450" cy="3175635"/>
+            <wp:effectExtent l="19050" t="19050" r="12700" b="24765"/>
+            <wp:docPr id="13" name="Kép 13"/>
+            <wp:cNvGraphicFramePr>
+              <a:graphicFrameLocks xmlns:a="http://schemas.openxmlformats.org/drawingml/2006/main" noChangeAspect="1"/>
+            </wp:cNvGraphicFramePr>
+            <a:graphic xmlns:a="http://schemas.openxmlformats.org/drawingml/2006/main">
+              <a:graphicData uri="http://schemas.openxmlformats.org/drawingml/2006/picture">
+                <pic:pic xmlns:pic="http://schemas.openxmlformats.org/drawingml/2006/picture">
+                  <pic:nvPicPr>
+                    <pic:cNvPr id="0" name="Picture 21"/>
+                    <pic:cNvPicPr>
+                      <a:picLocks noChangeAspect="1" noChangeArrowheads="1"/>
+                    </pic:cNvPicPr>
+                  </pic:nvPicPr>
+                  <pic:blipFill>
+                    <a:blip r:embed="rId44">
+                      <a:extLst>
+                        <a:ext uri="{28A0092B-C50C-407E-A947-70E740481C1C}">
+                          <a14:useLocalDpi xmlns:a14="http://schemas.microsoft.com/office/drawing/2010/main" val="0"/>
+                        </a:ext>
+                      </a:extLst>
+                    </a:blip>
+                    <a:srcRect/>
+                    <a:stretch>
+                      <a:fillRect/>
+                    </a:stretch>
+                  </pic:blipFill>
+                  <pic:spPr bwMode="auto">
+                    <a:xfrm>
+                      <a:off x="0" y="0"/>
+                      <a:ext cx="5759450" cy="3175635"/>
+                    </a:xfrm>
+                    <a:prstGeom prst="rect">
+                      <a:avLst/>
+                    </a:prstGeom>
+                    <a:noFill/>
+                    <a:ln>
+                      <a:solidFill>
+                        <a:schemeClr val="tx1"/>
+                      </a:solidFill>
+                    </a:ln>
+                  </pic:spPr>
+                </pic:pic>
+              </a:graphicData>
+            </a:graphic>
+          </wp:inline>
+        </w:drawing>
+      </w:r>
+    </w:p>
+    <w:p>
+      <w:pPr>
+        <w:spacing w:before="100" w:beforeAutospacing="1" w:after="100" w:afterAutospacing="1" w:line="240" w:lineRule="auto"/>
+        <w:jc w:val="left"/>
+        <w:rPr>
+          <w:rFonts w:eastAsia="Times New Roman" w:cs="Times New Roman"/>
+          <w:szCs w:val="24"/>
+          <w:lang w:val="hu-HU" w:eastAsia="hu-HU"/>
+        </w:rPr>
+      </w:pPr>
+      <w:r>
+        <w:rPr>
+          <w:rFonts w:eastAsia="Times New Roman" w:cs="Times New Roman"/>
+          <w:szCs w:val="24"/>
+          <w:lang w:val="hu-HU" w:eastAsia="hu-HU"/>
+        </w:rPr>
+        <w:drawing>
+          <wp:inline distT="0" distB="0" distL="0" distR="0" wp14:anchorId="1EF7C276" wp14:editId="24E61441">
+            <wp:extent cx="5759450" cy="3239770"/>
+            <wp:effectExtent l="19050" t="19050" r="12700" b="17780"/>
+            <wp:docPr id="1" name="Kép 1"/>
+            <wp:cNvGraphicFramePr>
+              <a:graphicFrameLocks xmlns:a="http://schemas.openxmlformats.org/drawingml/2006/main" noChangeAspect="1"/>
+            </wp:cNvGraphicFramePr>
+            <a:graphic xmlns:a="http://schemas.openxmlformats.org/drawingml/2006/main">
+              <a:graphicData uri="http://schemas.openxmlformats.org/drawingml/2006/picture">
+                <pic:pic xmlns:pic="http://schemas.openxmlformats.org/drawingml/2006/picture">
+                  <pic:nvPicPr>
+                    <pic:cNvPr id="1" name=""/>
+                    <pic:cNvPicPr/>
+                  </pic:nvPicPr>
+                  <pic:blipFill>
+                    <a:blip r:embed="rId45"/>
+                    <a:stretch>
+                      <a:fillRect/>
+                    </a:stretch>
+                  </pic:blipFill>
+                  <pic:spPr>
+                    <a:xfrm>
+                      <a:off x="0" y="0"/>
+                      <a:ext cx="5759450" cy="3239770"/>
+                    </a:xfrm>
+                    <a:prstGeom prst="rect">
+                      <a:avLst/>
+                    </a:prstGeom>
+                    <a:ln>
+                      <a:solidFill>
+                        <a:schemeClr val="tx1"/>
+                      </a:solidFill>
+                    </a:ln>
+                  </pic:spPr>
+                </pic:pic>
+              </a:graphicData>
+            </a:graphic>
+          </wp:inline>
+        </w:drawing>
+      </w:r>
+    </w:p>
+    <w:p>
+      <w:pPr>
+        <w:spacing w:before="100" w:beforeAutospacing="1" w:after="100" w:afterAutospacing="1" w:line="240" w:lineRule="auto"/>
+        <w:jc w:val="left"/>
+        <w:rPr>
+          <w:rFonts w:eastAsia="Times New Roman" w:cs="Times New Roman"/>
+          <w:szCs w:val="24"/>
+          <w:lang w:val="hu-HU" w:eastAsia="hu-HU"/>
+        </w:rPr>
+      </w:pPr>
+      <w:r>
+        <w:rPr>
+          <w:rFonts w:eastAsia="Times New Roman" w:cs="Times New Roman"/>
+          <w:szCs w:val="24"/>
+          <w:lang w:val="hu-HU" w:eastAsia="hu-HU"/>
+        </w:rPr>
+        <w:t>A képeken a létrehozott szervezeti egységek és a kliensoldali sikeres autentikáció látható, ami igazolja a Kerberos hitelesítés működését.</w:t>
+      </w:r>
+    </w:p>
+    <w:p>
+      <w:pPr>
+        <w:spacing w:before="100" w:beforeAutospacing="1" w:after="100" w:afterAutospacing="1" w:line="240" w:lineRule="auto"/>
+        <w:jc w:val="left"/>
+        <w:rPr>
+          <w:rFonts w:eastAsia="Times New Roman" w:cs="Times New Roman"/>
+          <w:szCs w:val="24"/>
+          <w:lang w:val="hu-HU" w:eastAsia="hu-HU"/>
+        </w:rPr>
+      </w:pPr>
+      <w:r>
+        <w:rPr>
+          <w:rFonts w:eastAsia="Times New Roman" w:cs="Times New Roman"/>
+          <w:szCs w:val="24"/>
+          <w:lang w:val="hu-HU" w:eastAsia="hu-HU"/>
+        </w:rPr>
+        <w:t>A központi címtár elérése zavartalan, a jogosultságkezelés alapjai megfelelően működnek.</w:t>
+      </w:r>
+    </w:p>
+    <w:p>
+      <w:pPr>
         <w:pStyle w:val="Cmsor2"/>
       </w:pPr>
       <w:bookmarkStart w:id="14" w:name="_Toc227537809"/>
       <w:r>
+        <w:lastRenderedPageBreak/>
         <w:t>15. DHCP</w:t>
       </w:r>
       <w:bookmarkEnd w:id="14"/>
@@ -7437,6 +8925,7 @@
       </w:pPr>
       <w:bookmarkStart w:id="20" w:name="_Toc227537815"/>
       <w:r>
+        <w:lastRenderedPageBreak/>
         <w:t>21. Hálózatautomatizáció</w:t>
       </w:r>
       <w:bookmarkEnd w:id="20"/>
@@ -7628,9 +9117,9 @@
       </w:pPr>
     </w:p>
     <w:sectPr>
-      <w:headerReference w:type="even" r:id="rId39"/>
-      <w:headerReference w:type="default" r:id="rId40"/>
-      <w:headerReference w:type="first" r:id="rId41"/>
+      <w:headerReference w:type="even" r:id="rId46"/>
+      <w:headerReference w:type="default" r:id="rId47"/>
+      <w:headerReference w:type="first" r:id="rId48"/>
       <w:pgSz w:w="11906" w:h="16838" w:code="9"/>
       <w:pgMar w:top="1418" w:right="1418" w:bottom="1418" w:left="1418" w:header="425" w:footer="709" w:gutter="0"/>
       <w:pgNumType w:start="1"/>
@@ -7800,7 +9289,7 @@
         </mc:Choice>
         <mc:Fallback>
           <w:pict>
-            <v:rect w14:anchorId="39787EA0" id="Téglalap 5" o:spid="_x0000_s1048" style="position:absolute;left:0;text-align:left;margin-left:0;margin-top:795.45pt;width:36pt;height:25.25pt;z-index:251663360;visibility:visible;mso-wrap-style:square;mso-wrap-distance-left:14.4pt;mso-wrap-distance-top:0;mso-wrap-distance-right:14.4pt;mso-wrap-distance-bottom:0;mso-position-horizontal:left;mso-position-horizontal-relative:right-margin-area;mso-position-vertical:absolute;mso-position-vertical-relative:page;v-text-anchor:bottom" o:gfxdata="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" fillcolor="#f6762c" stroked="f" strokeweight="3pt">
+            <v:rect w14:anchorId="39787EA0" id="Téglalap 5" o:spid="_x0000_s1055" style="position:absolute;left:0;text-align:left;margin-left:0;margin-top:795.45pt;width:36pt;height:25.25pt;z-index:251663360;visibility:visible;mso-wrap-style:square;mso-wrap-distance-left:14.4pt;mso-wrap-distance-top:0;mso-wrap-distance-right:14.4pt;mso-wrap-distance-bottom:0;mso-position-horizontal:left;mso-position-horizontal-relative:right-margin-area;mso-position-vertical:absolute;mso-position-vertical-relative:page;v-text-anchor:bottom" o:gfxdata="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" fillcolor="#f6762c" stroked="f" strokeweight="3pt">
               <v:textbox>
                 <w:txbxContent>
                   <w:p>
@@ -8896,6 +10385,118 @@
     </w:lvl>
   </w:abstractNum>
   <w:abstractNum w:abstractNumId="2" w15:restartNumberingAfterBreak="0">
+    <w:nsid w:val="14082DDC"/>
+    <w:multiLevelType w:val="hybridMultilevel"/>
+    <w:tmpl w:val="6D06FDD4"/>
+    <w:lvl w:ilvl="0" w:tplc="040E0001">
+      <w:numFmt w:val="bullet"/>
+      <w:lvlText w:val=""/>
+      <w:lvlJc w:val="left"/>
+      <w:pPr>
+        <w:ind w:left="720" w:hanging="360"/>
+      </w:pPr>
+      <w:rPr>
+        <w:rFonts w:ascii="Symbol" w:eastAsia="Times New Roman" w:hAnsi="Symbol" w:cs="Times New Roman" w:hint="default"/>
+      </w:rPr>
+    </w:lvl>
+    <w:lvl w:ilvl="1" w:tplc="040E0003" w:tentative="1">
+      <w:start w:val="1"/>
+      <w:numFmt w:val="bullet"/>
+      <w:lvlText w:val="o"/>
+      <w:lvlJc w:val="left"/>
+      <w:pPr>
+        <w:ind w:left="1440" w:hanging="360"/>
+      </w:pPr>
+      <w:rPr>
+        <w:rFonts w:ascii="Courier New" w:hAnsi="Courier New" w:cs="Courier New" w:hint="default"/>
+      </w:rPr>
+    </w:lvl>
+    <w:lvl w:ilvl="2" w:tplc="040E0005" w:tentative="1">
+      <w:start w:val="1"/>
+      <w:numFmt w:val="bullet"/>
+      <w:lvlText w:val=""/>
+      <w:lvlJc w:val="left"/>
+      <w:pPr>
+        <w:ind w:left="2160" w:hanging="360"/>
+      </w:pPr>
+      <w:rPr>
+        <w:rFonts w:ascii="Wingdings" w:hAnsi="Wingdings" w:hint="default"/>
+      </w:rPr>
+    </w:lvl>
+    <w:lvl w:ilvl="3" w:tplc="040E0001">
+      <w:start w:val="1"/>
+      <w:numFmt w:val="bullet"/>
+      <w:lvlText w:val=""/>
+      <w:lvlJc w:val="left"/>
+      <w:pPr>
+        <w:ind w:left="2880" w:hanging="360"/>
+      </w:pPr>
+      <w:rPr>
+        <w:rFonts w:ascii="Symbol" w:hAnsi="Symbol" w:hint="default"/>
+      </w:rPr>
+    </w:lvl>
+    <w:lvl w:ilvl="4" w:tplc="040E0003" w:tentative="1">
+      <w:start w:val="1"/>
+      <w:numFmt w:val="bullet"/>
+      <w:lvlText w:val="o"/>
+      <w:lvlJc w:val="left"/>
+      <w:pPr>
+        <w:ind w:left="3600" w:hanging="360"/>
+      </w:pPr>
+      <w:rPr>
+        <w:rFonts w:ascii="Courier New" w:hAnsi="Courier New" w:cs="Courier New" w:hint="default"/>
+      </w:rPr>
+    </w:lvl>
+    <w:lvl w:ilvl="5" w:tplc="040E0005" w:tentative="1">
+      <w:start w:val="1"/>
+      <w:numFmt w:val="bullet"/>
+      <w:lvlText w:val=""/>
+      <w:lvlJc w:val="left"/>
+      <w:pPr>
+        <w:ind w:left="4320" w:hanging="360"/>
+      </w:pPr>
+      <w:rPr>
+        <w:rFonts w:ascii="Wingdings" w:hAnsi="Wingdings" w:hint="default"/>
+      </w:rPr>
+    </w:lvl>
+    <w:lvl w:ilvl="6" w:tplc="040E0001" w:tentative="1">
+      <w:start w:val="1"/>
+      <w:numFmt w:val="bullet"/>
+      <w:lvlText w:val=""/>
+      <w:lvlJc w:val="left"/>
+      <w:pPr>
+        <w:ind w:left="5040" w:hanging="360"/>
+      </w:pPr>
+      <w:rPr>
+        <w:rFonts w:ascii="Symbol" w:hAnsi="Symbol" w:hint="default"/>
+      </w:rPr>
+    </w:lvl>
+    <w:lvl w:ilvl="7" w:tplc="040E0003" w:tentative="1">
+      <w:start w:val="1"/>
+      <w:numFmt w:val="bullet"/>
+      <w:lvlText w:val="o"/>
+      <w:lvlJc w:val="left"/>
+      <w:pPr>
+        <w:ind w:left="5760" w:hanging="360"/>
+      </w:pPr>
+      <w:rPr>
+        <w:rFonts w:ascii="Courier New" w:hAnsi="Courier New" w:cs="Courier New" w:hint="default"/>
+      </w:rPr>
+    </w:lvl>
+    <w:lvl w:ilvl="8" w:tplc="040E0005" w:tentative="1">
+      <w:start w:val="1"/>
+      <w:numFmt w:val="bullet"/>
+      <w:lvlText w:val=""/>
+      <w:lvlJc w:val="left"/>
+      <w:pPr>
+        <w:ind w:left="6480" w:hanging="360"/>
+      </w:pPr>
+      <w:rPr>
+        <w:rFonts w:ascii="Wingdings" w:hAnsi="Wingdings" w:hint="default"/>
+      </w:rPr>
+    </w:lvl>
+  </w:abstractNum>
+  <w:abstractNum w:abstractNumId="3" w15:restartNumberingAfterBreak="0">
     <w:nsid w:val="15E11B97"/>
     <w:multiLevelType w:val="hybridMultilevel"/>
     <w:tmpl w:val="0CBE3CEC"/>
@@ -8985,7 +10586,7 @@
       </w:pPr>
     </w:lvl>
   </w:abstractNum>
-  <w:abstractNum w:abstractNumId="3" w15:restartNumberingAfterBreak="0">
+  <w:abstractNum w:abstractNumId="4" w15:restartNumberingAfterBreak="0">
     <w:nsid w:val="22B10922"/>
     <w:multiLevelType w:val="hybridMultilevel"/>
     <w:tmpl w:val="395CD11C"/>
@@ -9074,7 +10675,7 @@
       </w:pPr>
     </w:lvl>
   </w:abstractNum>
-  <w:abstractNum w:abstractNumId="4" w15:restartNumberingAfterBreak="0">
+  <w:abstractNum w:abstractNumId="5" w15:restartNumberingAfterBreak="0">
     <w:nsid w:val="259A2BB3"/>
     <w:multiLevelType w:val="hybridMultilevel"/>
     <w:tmpl w:val="74CACC3A"/>
@@ -9163,7 +10764,120 @@
       </w:pPr>
     </w:lvl>
   </w:abstractNum>
-  <w:abstractNum w:abstractNumId="5" w15:restartNumberingAfterBreak="0">
+  <w:abstractNum w:abstractNumId="6" w15:restartNumberingAfterBreak="0">
+    <w:nsid w:val="29223A08"/>
+    <w:multiLevelType w:val="hybridMultilevel"/>
+    <w:tmpl w:val="E924A71A"/>
+    <w:lvl w:ilvl="0" w:tplc="040E0001">
+      <w:start w:val="1"/>
+      <w:numFmt w:val="bullet"/>
+      <w:lvlText w:val=""/>
+      <w:lvlJc w:val="left"/>
+      <w:pPr>
+        <w:ind w:left="720" w:hanging="360"/>
+      </w:pPr>
+      <w:rPr>
+        <w:rFonts w:ascii="Symbol" w:hAnsi="Symbol" w:hint="default"/>
+      </w:rPr>
+    </w:lvl>
+    <w:lvl w:ilvl="1" w:tplc="040E0003" w:tentative="1">
+      <w:start w:val="1"/>
+      <w:numFmt w:val="bullet"/>
+      <w:lvlText w:val="o"/>
+      <w:lvlJc w:val="left"/>
+      <w:pPr>
+        <w:ind w:left="1440" w:hanging="360"/>
+      </w:pPr>
+      <w:rPr>
+        <w:rFonts w:ascii="Courier New" w:hAnsi="Courier New" w:cs="Courier New" w:hint="default"/>
+      </w:rPr>
+    </w:lvl>
+    <w:lvl w:ilvl="2" w:tplc="040E0005" w:tentative="1">
+      <w:start w:val="1"/>
+      <w:numFmt w:val="bullet"/>
+      <w:lvlText w:val=""/>
+      <w:lvlJc w:val="left"/>
+      <w:pPr>
+        <w:ind w:left="2160" w:hanging="360"/>
+      </w:pPr>
+      <w:rPr>
+        <w:rFonts w:ascii="Wingdings" w:hAnsi="Wingdings" w:hint="default"/>
+      </w:rPr>
+    </w:lvl>
+    <w:lvl w:ilvl="3" w:tplc="040E0001" w:tentative="1">
+      <w:start w:val="1"/>
+      <w:numFmt w:val="bullet"/>
+      <w:lvlText w:val=""/>
+      <w:lvlJc w:val="left"/>
+      <w:pPr>
+        <w:ind w:left="2880" w:hanging="360"/>
+      </w:pPr>
+      <w:rPr>
+        <w:rFonts w:ascii="Symbol" w:hAnsi="Symbol" w:hint="default"/>
+      </w:rPr>
+    </w:lvl>
+    <w:lvl w:ilvl="4" w:tplc="040E0003" w:tentative="1">
+      <w:start w:val="1"/>
+      <w:numFmt w:val="bullet"/>
+      <w:lvlText w:val="o"/>
+      <w:lvlJc w:val="left"/>
+      <w:pPr>
+        <w:ind w:left="3600" w:hanging="360"/>
+      </w:pPr>
+      <w:rPr>
+        <w:rFonts w:ascii="Courier New" w:hAnsi="Courier New" w:cs="Courier New" w:hint="default"/>
+      </w:rPr>
+    </w:lvl>
+    <w:lvl w:ilvl="5" w:tplc="040E0005" w:tentative="1">
+      <w:start w:val="1"/>
+      <w:numFmt w:val="bullet"/>
+      <w:lvlText w:val=""/>
+      <w:lvlJc w:val="left"/>
+      <w:pPr>
+        <w:ind w:left="4320" w:hanging="360"/>
+      </w:pPr>
+      <w:rPr>
+        <w:rFonts w:ascii="Wingdings" w:hAnsi="Wingdings" w:hint="default"/>
+      </w:rPr>
+    </w:lvl>
+    <w:lvl w:ilvl="6" w:tplc="040E0001" w:tentative="1">
+      <w:start w:val="1"/>
+      <w:numFmt w:val="bullet"/>
+      <w:lvlText w:val=""/>
+      <w:lvlJc w:val="left"/>
+      <w:pPr>
+        <w:ind w:left="5040" w:hanging="360"/>
+      </w:pPr>
+      <w:rPr>
+        <w:rFonts w:ascii="Symbol" w:hAnsi="Symbol" w:hint="default"/>
+      </w:rPr>
+    </w:lvl>
+    <w:lvl w:ilvl="7" w:tplc="040E0003" w:tentative="1">
+      <w:start w:val="1"/>
+      <w:numFmt w:val="bullet"/>
+      <w:lvlText w:val="o"/>
+      <w:lvlJc w:val="left"/>
+      <w:pPr>
+        <w:ind w:left="5760" w:hanging="360"/>
+      </w:pPr>
+      <w:rPr>
+        <w:rFonts w:ascii="Courier New" w:hAnsi="Courier New" w:cs="Courier New" w:hint="default"/>
+      </w:rPr>
+    </w:lvl>
+    <w:lvl w:ilvl="8" w:tplc="040E0005" w:tentative="1">
+      <w:start w:val="1"/>
+      <w:numFmt w:val="bullet"/>
+      <w:lvlText w:val=""/>
+      <w:lvlJc w:val="left"/>
+      <w:pPr>
+        <w:ind w:left="6480" w:hanging="360"/>
+      </w:pPr>
+      <w:rPr>
+        <w:rFonts w:ascii="Wingdings" w:hAnsi="Wingdings" w:hint="default"/>
+      </w:rPr>
+    </w:lvl>
+  </w:abstractNum>
+  <w:abstractNum w:abstractNumId="7" w15:restartNumberingAfterBreak="0">
     <w:nsid w:val="4AED27B3"/>
     <w:multiLevelType w:val="multilevel"/>
     <w:tmpl w:val="8690B146"/>
@@ -9276,7 +10990,7 @@
       </w:rPr>
     </w:lvl>
   </w:abstractNum>
-  <w:abstractNum w:abstractNumId="6" w15:restartNumberingAfterBreak="0">
+  <w:abstractNum w:abstractNumId="8" w15:restartNumberingAfterBreak="0">
     <w:nsid w:val="5C2F4C6E"/>
     <w:multiLevelType w:val="multilevel"/>
     <w:tmpl w:val="0409001D"/>
@@ -9362,7 +11076,7 @@
       </w:pPr>
     </w:lvl>
   </w:abstractNum>
-  <w:abstractNum w:abstractNumId="7" w15:restartNumberingAfterBreak="0">
+  <w:abstractNum w:abstractNumId="9" w15:restartNumberingAfterBreak="0">
     <w:nsid w:val="5EDA22E4"/>
     <w:multiLevelType w:val="hybridMultilevel"/>
     <w:tmpl w:val="351E224E"/>
@@ -9476,7 +11190,7 @@
       </w:rPr>
     </w:lvl>
   </w:abstractNum>
-  <w:abstractNum w:abstractNumId="8" w15:restartNumberingAfterBreak="0">
+  <w:abstractNum w:abstractNumId="10" w15:restartNumberingAfterBreak="0">
     <w:nsid w:val="60264DAA"/>
     <w:multiLevelType w:val="multilevel"/>
     <w:tmpl w:val="925E9452"/>
@@ -9571,7 +11285,7 @@
       </w:pPr>
     </w:lvl>
   </w:abstractNum>
-  <w:abstractNum w:abstractNumId="9" w15:restartNumberingAfterBreak="0">
+  <w:abstractNum w:abstractNumId="11" w15:restartNumberingAfterBreak="0">
     <w:nsid w:val="6028346E"/>
     <w:multiLevelType w:val="multilevel"/>
     <w:tmpl w:val="3D9E6368"/>
@@ -9720,7 +11434,7 @@
       </w:rPr>
     </w:lvl>
   </w:abstractNum>
-  <w:abstractNum w:abstractNumId="10" w15:restartNumberingAfterBreak="0">
+  <w:abstractNum w:abstractNumId="12" w15:restartNumberingAfterBreak="0">
     <w:nsid w:val="602F391C"/>
     <w:multiLevelType w:val="multilevel"/>
     <w:tmpl w:val="0409001F"/>
@@ -9806,7 +11520,7 @@
       </w:pPr>
     </w:lvl>
   </w:abstractNum>
-  <w:abstractNum w:abstractNumId="11" w15:restartNumberingAfterBreak="0">
+  <w:abstractNum w:abstractNumId="13" w15:restartNumberingAfterBreak="0">
     <w:nsid w:val="618D22B4"/>
     <w:multiLevelType w:val="multilevel"/>
     <w:tmpl w:val="0409001F"/>
@@ -9892,7 +11606,7 @@
       </w:pPr>
     </w:lvl>
   </w:abstractNum>
-  <w:abstractNum w:abstractNumId="12" w15:restartNumberingAfterBreak="0">
+  <w:abstractNum w:abstractNumId="14" w15:restartNumberingAfterBreak="0">
     <w:nsid w:val="6B1D0DB6"/>
     <w:multiLevelType w:val="hybridMultilevel"/>
     <w:tmpl w:val="5DF616E6"/>
@@ -10005,7 +11719,7 @@
       </w:rPr>
     </w:lvl>
   </w:abstractNum>
-  <w:abstractNum w:abstractNumId="13" w15:restartNumberingAfterBreak="0">
+  <w:abstractNum w:abstractNumId="15" w15:restartNumberingAfterBreak="0">
     <w:nsid w:val="78D26A8C"/>
     <w:multiLevelType w:val="hybridMultilevel"/>
     <w:tmpl w:val="5032E86C"/>
@@ -10094,47 +11808,205 @@
       </w:pPr>
     </w:lvl>
   </w:abstractNum>
+  <w:abstractNum w:abstractNumId="16" w15:restartNumberingAfterBreak="0">
+    <w:nsid w:val="7CB03DBE"/>
+    <w:multiLevelType w:val="multilevel"/>
+    <w:tmpl w:val="E836114C"/>
+    <w:lvl w:ilvl="0">
+      <w:start w:val="1"/>
+      <w:numFmt w:val="bullet"/>
+      <w:lvlText w:val=""/>
+      <w:lvlJc w:val="left"/>
+      <w:pPr>
+        <w:tabs>
+          <w:tab w:val="num" w:pos="720"/>
+        </w:tabs>
+        <w:ind w:left="720" w:hanging="360"/>
+      </w:pPr>
+      <w:rPr>
+        <w:rFonts w:ascii="Symbol" w:hAnsi="Symbol" w:hint="default"/>
+        <w:sz w:val="20"/>
+      </w:rPr>
+    </w:lvl>
+    <w:lvl w:ilvl="1" w:tentative="1">
+      <w:start w:val="1"/>
+      <w:numFmt w:val="bullet"/>
+      <w:lvlText w:val="o"/>
+      <w:lvlJc w:val="left"/>
+      <w:pPr>
+        <w:tabs>
+          <w:tab w:val="num" w:pos="1440"/>
+        </w:tabs>
+        <w:ind w:left="1440" w:hanging="360"/>
+      </w:pPr>
+      <w:rPr>
+        <w:rFonts w:ascii="Courier New" w:hAnsi="Courier New" w:hint="default"/>
+        <w:sz w:val="20"/>
+      </w:rPr>
+    </w:lvl>
+    <w:lvl w:ilvl="2" w:tentative="1">
+      <w:start w:val="1"/>
+      <w:numFmt w:val="bullet"/>
+      <w:lvlText w:val=""/>
+      <w:lvlJc w:val="left"/>
+      <w:pPr>
+        <w:tabs>
+          <w:tab w:val="num" w:pos="2160"/>
+        </w:tabs>
+        <w:ind w:left="2160" w:hanging="360"/>
+      </w:pPr>
+      <w:rPr>
+        <w:rFonts w:ascii="Wingdings" w:hAnsi="Wingdings" w:hint="default"/>
+        <w:sz w:val="20"/>
+      </w:rPr>
+    </w:lvl>
+    <w:lvl w:ilvl="3" w:tentative="1">
+      <w:start w:val="1"/>
+      <w:numFmt w:val="bullet"/>
+      <w:lvlText w:val=""/>
+      <w:lvlJc w:val="left"/>
+      <w:pPr>
+        <w:tabs>
+          <w:tab w:val="num" w:pos="2880"/>
+        </w:tabs>
+        <w:ind w:left="2880" w:hanging="360"/>
+      </w:pPr>
+      <w:rPr>
+        <w:rFonts w:ascii="Wingdings" w:hAnsi="Wingdings" w:hint="default"/>
+        <w:sz w:val="20"/>
+      </w:rPr>
+    </w:lvl>
+    <w:lvl w:ilvl="4" w:tentative="1">
+      <w:start w:val="1"/>
+      <w:numFmt w:val="bullet"/>
+      <w:lvlText w:val=""/>
+      <w:lvlJc w:val="left"/>
+      <w:pPr>
+        <w:tabs>
+          <w:tab w:val="num" w:pos="3600"/>
+        </w:tabs>
+        <w:ind w:left="3600" w:hanging="360"/>
+      </w:pPr>
+      <w:rPr>
+        <w:rFonts w:ascii="Wingdings" w:hAnsi="Wingdings" w:hint="default"/>
+        <w:sz w:val="20"/>
+      </w:rPr>
+    </w:lvl>
+    <w:lvl w:ilvl="5" w:tentative="1">
+      <w:start w:val="1"/>
+      <w:numFmt w:val="bullet"/>
+      <w:lvlText w:val=""/>
+      <w:lvlJc w:val="left"/>
+      <w:pPr>
+        <w:tabs>
+          <w:tab w:val="num" w:pos="4320"/>
+        </w:tabs>
+        <w:ind w:left="4320" w:hanging="360"/>
+      </w:pPr>
+      <w:rPr>
+        <w:rFonts w:ascii="Wingdings" w:hAnsi="Wingdings" w:hint="default"/>
+        <w:sz w:val="20"/>
+      </w:rPr>
+    </w:lvl>
+    <w:lvl w:ilvl="6" w:tentative="1">
+      <w:start w:val="1"/>
+      <w:numFmt w:val="bullet"/>
+      <w:lvlText w:val=""/>
+      <w:lvlJc w:val="left"/>
+      <w:pPr>
+        <w:tabs>
+          <w:tab w:val="num" w:pos="5040"/>
+        </w:tabs>
+        <w:ind w:left="5040" w:hanging="360"/>
+      </w:pPr>
+      <w:rPr>
+        <w:rFonts w:ascii="Wingdings" w:hAnsi="Wingdings" w:hint="default"/>
+        <w:sz w:val="20"/>
+      </w:rPr>
+    </w:lvl>
+    <w:lvl w:ilvl="7" w:tentative="1">
+      <w:start w:val="1"/>
+      <w:numFmt w:val="bullet"/>
+      <w:lvlText w:val=""/>
+      <w:lvlJc w:val="left"/>
+      <w:pPr>
+        <w:tabs>
+          <w:tab w:val="num" w:pos="5760"/>
+        </w:tabs>
+        <w:ind w:left="5760" w:hanging="360"/>
+      </w:pPr>
+      <w:rPr>
+        <w:rFonts w:ascii="Wingdings" w:hAnsi="Wingdings" w:hint="default"/>
+        <w:sz w:val="20"/>
+      </w:rPr>
+    </w:lvl>
+    <w:lvl w:ilvl="8" w:tentative="1">
+      <w:start w:val="1"/>
+      <w:numFmt w:val="bullet"/>
+      <w:lvlText w:val=""/>
+      <w:lvlJc w:val="left"/>
+      <w:pPr>
+        <w:tabs>
+          <w:tab w:val="num" w:pos="6480"/>
+        </w:tabs>
+        <w:ind w:left="6480" w:hanging="360"/>
+      </w:pPr>
+      <w:rPr>
+        <w:rFonts w:ascii="Wingdings" w:hAnsi="Wingdings" w:hint="default"/>
+        <w:sz w:val="20"/>
+      </w:rPr>
+    </w:lvl>
+  </w:abstractNum>
   <w:num w:numId="1">
-    <w:abstractNumId w:val="10"/>
+    <w:abstractNumId w:val="12"/>
   </w:num>
   <w:num w:numId="2">
-    <w:abstractNumId w:val="2"/>
+    <w:abstractNumId w:val="3"/>
   </w:num>
   <w:num w:numId="3">
-    <w:abstractNumId w:val="11"/>
+    <w:abstractNumId w:val="13"/>
   </w:num>
   <w:num w:numId="4">
-    <w:abstractNumId w:val="6"/>
+    <w:abstractNumId w:val="8"/>
   </w:num>
   <w:num w:numId="5">
     <w:abstractNumId w:val="0"/>
   </w:num>
   <w:num w:numId="6">
-    <w:abstractNumId w:val="8"/>
+    <w:abstractNumId w:val="10"/>
   </w:num>
   <w:num w:numId="7">
-    <w:abstractNumId w:val="5"/>
+    <w:abstractNumId w:val="7"/>
   </w:num>
   <w:num w:numId="8">
     <w:abstractNumId w:val="1"/>
   </w:num>
   <w:num w:numId="9">
+    <w:abstractNumId w:val="11"/>
+  </w:num>
+  <w:num w:numId="10">
+    <w:abstractNumId w:val="4"/>
+  </w:num>
+  <w:num w:numId="11">
+    <w:abstractNumId w:val="5"/>
+  </w:num>
+  <w:num w:numId="12">
+    <w:abstractNumId w:val="14"/>
+  </w:num>
+  <w:num w:numId="13">
     <w:abstractNumId w:val="9"/>
   </w:num>
-  <w:num w:numId="10">
-    <w:abstractNumId w:val="3"/>
+  <w:num w:numId="14">
+    <w:abstractNumId w:val="15"/>
   </w:num>
-  <w:num w:numId="11">
-    <w:abstractNumId w:val="4"/>
+  <w:num w:numId="15">
+    <w:abstractNumId w:val="16"/>
   </w:num>
-  <w:num w:numId="12">
-    <w:abstractNumId w:val="12"/>
+  <w:num w:numId="16">
+    <w:abstractNumId w:val="6"/>
   </w:num>
-  <w:num w:numId="13">
-    <w:abstractNumId w:val="7"/>
-  </w:num>
-  <w:num w:numId="14">
-    <w:abstractNumId w:val="13"/>
+  <w:num w:numId="17">
+    <w:abstractNumId w:val="2"/>
   </w:num>
 </w:numbering>
 </file>

</xml_diff>